<commit_message>
docs: add auto-report description to paper Section 2.7
Describes the auto-generated HTML diagnostic report with its four
visualizations (rank-abundance, size-vs-abundance, coverage distribution,
pre/post VLP composition) and the viroforge report --format html command.

Co-Authored-By: Claude Opus 4.6 <noreply@anthropic.com>
</commit_message>
<xml_diff>
--- a/docs/ViroForge_Paper_Revised.docx
+++ b/docs/ViroForge_Paper_Revised.docx
@@ -2075,7 +2075,25 @@
           <w:i w:val="0"/>
           <w:sz w:val="22"/>
         </w:rPr>
-        <w:t>benchmark. All random operations use seeded RNG instances for full reproducibility.</w:t>
+        <w:t xml:space="preserve">benchmark. All random operations use seeded RNG instances for full reproducibility. Each </w:t>
+      </w:r>
+      <w:r>
+        <w:rPr>
+          <w:rFonts w:ascii="Times New Roman" w:hAnsi="Times New Roman"/>
+          <w:b w:val="0"/>
+          <w:i w:val="0"/>
+          <w:sz w:val="22"/>
+        </w:rPr>
+        <w:t xml:space="preserve">generate run automatically produces a self-contained HTML diagnostic report including rank-abundance curves, genome size versus abundance scatter plots, expected coverage distributions, and pre/post VLP composition charts, enabling users to visually verify dataset properties before downstream analysis. Reports can also be regenerated for existing datasets via </w:t>
+      </w:r>
+      <w:r>
+        <w:rPr>
+          <w:rFonts w:ascii="Times New Roman" w:hAnsi="Times New Roman"/>
+          <w:b w:val="0"/>
+          <w:i w:val="0"/>
+          <w:sz w:val="22"/>
+        </w:rPr>
+        <w:t>viroforge report --format html.</w:t>
       </w:r>
     </w:p>
     <w:p>

</xml_diff>

<commit_message>
feat: add visual HTML reports for benchmark modules and update paper
- Add viroforge/benchmarking/html_report.py with self-contained HTML+SVG reports
  for QC (removal bars, confusion matrix), Assembly (recovery categories,
  completeness scatter), and Taxonomy (per-rank precision/recall/F1, stacked
  classification breakdown)
- Wire HTML report generation into CLI benchmark commands (auto-generated
  alongside JSON/markdown)
- Wire HTML reports into web interface benchmark results (embedded iframe)
- Update paper Section 2.7 to describe benchmark HTML reports and web interface
- Update paper Abstract to mention browser-based web interface
- Regenerate ViroForge_Paper_Revised.docx

Co-Authored-By: Claude Opus 4.6 <noreply@anthropic.com>
</commit_message>
<xml_diff>
--- a/docs/ViroForge_Paper_Revised.docx
+++ b/docs/ViroForge_Paper_Revised.docx
@@ -120,7 +120,16 @@
           <w:i w:val="0"/>
           <w:sz w:val="22"/>
         </w:rPr>
-        <w:t xml:space="preserve"> ViroForge is freely available at https://github.com/shandley/viroforge under the MIT license, with comprehensive documentation, tutorials, and example configurations. An interactive pipeline explorer is available at https://shandley.github.io/viroforge/pipeline_explorer. Implemented in Python (≥3.8), compatible with Linux, macOS, and Windows.</w:t>
+        <w:t xml:space="preserve"> ViroForge is freely available at https://github.com/shandley/viroforge under the MIT license, with comprehensive documentation, tutorials, and example configurations. A browser-based web interface (</w:t>
+      </w:r>
+      <w:r>
+        <w:rPr>
+          <w:rFonts w:ascii="Times New Roman" w:hAnsi="Times New Roman"/>
+          <w:b w:val="0"/>
+          <w:i w:val="0"/>
+          <w:sz w:val="22"/>
+        </w:rPr>
+        <w:t>viroforge web) provides interactive dataset generation and benchmarking. An interactive pipeline explorer is available at https://shandley.github.io/viroforge/pipeline_explorer. Implemented in Python (≥3.8), compatible with Linux, macOS, and Windows.</w:t>
       </w:r>
     </w:p>
     <w:p>
@@ -2075,7 +2084,19 @@
           <w:i w:val="0"/>
           <w:sz w:val="22"/>
         </w:rPr>
-        <w:t xml:space="preserve">benchmark. All random operations use seeded RNG instances for full reproducibility. Each </w:t>
+        <w:t>benchmark. All random operations use seeded RNG instances for full reproducibility.</w:t>
+      </w:r>
+    </w:p>
+    <w:p>
+      <w:pPr/>
+      <w:r>
+        <w:rPr>
+          <w:rFonts w:ascii="Times New Roman" w:hAnsi="Times New Roman"/>
+          <w:b w:val="0"/>
+          <w:i w:val="0"/>
+          <w:sz w:val="22"/>
+        </w:rPr>
+        <w:t xml:space="preserve">Each </w:t>
       </w:r>
       <w:r>
         <w:rPr>
@@ -2093,7 +2114,37 @@
           <w:i w:val="0"/>
           <w:sz w:val="22"/>
         </w:rPr>
-        <w:t>viroforge report --format html.</w:t>
+        <w:t xml:space="preserve">viroforge report --format html. Similarly, each </w:t>
+      </w:r>
+      <w:r>
+        <w:rPr>
+          <w:rFonts w:ascii="Times New Roman" w:hAnsi="Times New Roman"/>
+          <w:b w:val="0"/>
+          <w:i w:val="0"/>
+          <w:sz w:val="22"/>
+        </w:rPr>
+        <w:t>benchmark run produces a visual HTML report alongside the JSON and markdown outputs: QC reports include contamination removal bar charts by source type and a confusion matrix; assembly reports show genome recovery category distributions and observed-versus-expected completeness scatter plots; taxonomy reports display per-rank precision/recall/F1 grouped bar charts and known-versus-dark-matter classification breakdowns.</w:t>
+      </w:r>
+    </w:p>
+    <w:p>
+      <w:pPr/>
+      <w:r>
+        <w:rPr>
+          <w:rFonts w:ascii="Times New Roman" w:hAnsi="Times New Roman"/>
+          <w:b w:val="0"/>
+          <w:i w:val="0"/>
+          <w:sz w:val="22"/>
+        </w:rPr>
+        <w:t>In addition to the command-line interface, ViroForge provides a browser-based web interface (</w:t>
+      </w:r>
+      <w:r>
+        <w:rPr>
+          <w:rFonts w:ascii="Times New Roman" w:hAnsi="Times New Roman"/>
+          <w:b w:val="0"/>
+          <w:i w:val="0"/>
+          <w:sz w:val="22"/>
+        </w:rPr>
+        <w:t>viroforge web) built on Flask that exposes the full generation and benchmarking workflow through an interactive GUI. The web interface allows users to browse collections, configure and launch dataset generation with preset or custom parameters, run batch configurations, view diagnostic reports, compare datasets, and execute all three benchmarking modules (QC, assembly, taxonomy) with visual HTML results displayed directly in the browser. This lowers the barrier to entry for researchers unfamiliar with command-line tools while preserving access to the same parameters and ground-truth evaluation capabilities.</w:t>
       </w:r>
     </w:p>
     <w:p>

</xml_diff>